<commit_message>
Interactive fragment shader matrix calculator added
</commit_message>
<xml_diff>
--- a/Fragment_Shader_Matris_Islemleri_Teknik_Dokuman.docx
+++ b/Fragment_Shader_Matris_Islemleri_Teknik_Dokuman.docx
@@ -1842,6 +1842,1178 @@
         <w:t>State'i kaydet -&gt; fragment islemini calistir -&gt; state'i geri yukle.</w:t>
       </w:r>
     </w:p>
+    <w:p>
+      <w:pPr>
+        <w:pStyle w:val="Heading1"/>
+      </w:pPr>
+      <w:r>
+        <w:t>3. Fragment ve Compute Veri Erisimi</w:t>
+      </w:r>
+    </w:p>
+    <w:p>
+      <w:pPr>
+        <w:spacing w:after="120" w:line="300" w:lineRule="auto"/>
+      </w:pPr>
+      <w:r>
+        <w:rPr>
+          <w:rFonts w:ascii="Calibri" w:hAnsi="Calibri"/>
+          <w:b w:val="0"/>
+          <w:i w:val="0"/>
+          <w:color w:val="243447"/>
+          <w:sz w:val="22"/>
+        </w:rPr>
+        <w:t>Compute ve fragment yollarinda matematiksel islem aynidir; temel fark, matrislerin GPU belleğinde nasil temsil edildigi, shader tarafindan nasil okundugu ve sonucun nereye yazildigidir.</w:t>
+      </w:r>
+    </w:p>
+    <w:p>
+      <w:pPr>
+        <w:pStyle w:val="Heading2"/>
+      </w:pPr>
+      <w:r>
+        <w:t>3.1 Fragment Yolunda Verinin Tam Akisi</w:t>
+      </w:r>
+    </w:p>
+    <w:p>
+      <w:pPr>
+        <w:spacing w:before="60" w:after="140"/>
+        <w:ind w:left="317" w:right="317"/>
+        <w:shd w:fill="F2F4F7"/>
+      </w:pPr>
+      <w:r>
+        <w:rPr>
+          <w:rFonts w:ascii="Consolas" w:hAnsi="Consolas"/>
+          <w:b w:val="0"/>
+          <w:i w:val="0"/>
+          <w:color w:val="17212B"/>
+          <w:sz w:val="18"/>
+        </w:rPr>
+        <w:t>CPU'daki A/B matrisleri</w:t>
+        <w:br/>
+        <w:t xml:space="preserve">    -&gt; glTexImage2D</w:t>
+        <w:br/>
+        <w:t>GPU'daki A/B texture'lari</w:t>
+        <w:br/>
+        <w:t xml:space="preserve">    -&gt; texture2D</w:t>
+        <w:br/>
+        <w:t>Fragment shader hesabı (GPU register'lari)</w:t>
+        <w:br/>
+        <w:t xml:space="preserve">    -&gt; gl_FragColor</w:t>
+        <w:br/>
+        <w:t>FBO'ya bagli C texture'i</w:t>
+        <w:br/>
+        <w:t xml:space="preserve">    -&gt; glReadPixels</w:t>
+        <w:br/>
+        <w:t>CPU'daki C matrisi</w:t>
+      </w:r>
+    </w:p>
+    <w:p>
+      <w:pPr>
+        <w:spacing w:after="120" w:line="300" w:lineRule="auto"/>
+      </w:pPr>
+      <w:r>
+        <w:rPr>
+          <w:rFonts w:ascii="Calibri" w:hAnsi="Calibri"/>
+          <w:b w:val="0"/>
+          <w:i w:val="0"/>
+          <w:color w:val="243447"/>
+          <w:sz w:val="22"/>
+        </w:rPr>
+        <w:t>A ve B once CPU belleğinde float dizileri olarak olusturulur. Fragment yolunda SSBO bulunmadigi icin bu diziler RGBA32F texture'lara yuklenir. Matris degeri her texel'in yalnizca R kanalinda tutulur; G, B ve A kanallari hesap girdisi olarak kullanilmaz.</w:t>
+      </w:r>
+    </w:p>
+    <w:p>
+      <w:pPr>
+        <w:pStyle w:val="Heading2"/>
+      </w:pPr>
+      <w:r>
+        <w:t>3.2 Fragment Shader Texture'dan Nasil Okur?</w:t>
+      </w:r>
+    </w:p>
+    <w:p>
+      <w:pPr>
+        <w:spacing w:after="120" w:line="300" w:lineRule="auto"/>
+      </w:pPr>
+      <w:r>
+        <w:rPr>
+          <w:rFonts w:ascii="Calibri" w:hAnsi="Calibri"/>
+          <w:b w:val="0"/>
+          <w:i w:val="0"/>
+          <w:color w:val="243447"/>
+          <w:sz w:val="22"/>
+        </w:rPr>
+        <w:t>Compute shader SSBO'yu duz bir dizi gibi okuyabilir: A[index]. OpenGL ES 2.0 tarzi fragment shader ise sampler2D ile iki boyutlu ve normalize edilmis texture koordinati kullanmak zorundadir. Bu nedenle duz indis once (x,y), sonra (u,v) koordinatina cevrilir.</w:t>
+      </w:r>
+    </w:p>
+    <w:p>
+      <w:pPr>
+        <w:spacing w:before="60" w:after="140"/>
+        <w:ind w:left="317" w:right="317"/>
+        <w:shd w:fill="F2F4F7"/>
+      </w:pPr>
+      <w:r>
+        <w:rPr>
+          <w:rFonts w:ascii="Consolas" w:hAnsi="Consolas"/>
+          <w:b w:val="0"/>
+          <w:i w:val="0"/>
+          <w:color w:val="17212B"/>
+          <w:sz w:val="18"/>
+        </w:rPr>
+        <w:t>float y = floor(index / texture_width);</w:t>
+        <w:br/>
+        <w:t>float x = index - y * texture_width;</w:t>
+        <w:br/>
+        <w:t>vec2 uv = (vec2(x, y) + 0.5) / texture_size;</w:t>
+        <w:br/>
+        <w:t>float value = texture2D(A_texture, uv).r;</w:t>
+      </w:r>
+    </w:p>
+    <w:p>
+      <w:pPr>
+        <w:pStyle w:val="Heading2"/>
+      </w:pPr>
+      <w:r>
+        <w:t>3.3 Indis Donusumu Ornegi</w:t>
+      </w:r>
+    </w:p>
+    <w:p>
+      <w:pPr>
+        <w:spacing w:after="120" w:line="300" w:lineRule="auto"/>
+      </w:pPr>
+      <w:r>
+        <w:rPr>
+          <w:rFonts w:ascii="Calibri" w:hAnsi="Calibri"/>
+          <w:b w:val="0"/>
+          <w:i w:val="0"/>
+          <w:color w:val="243447"/>
+          <w:sz w:val="22"/>
+        </w:rPr>
+        <w:t>Texture 3x3 ve okunacak duz indis 5 olsun. Satir y=floor(5/3)=1, sutun x=5-(1x3)=2 olur. Yani indis 5, matrisin [1][2] elemanidir. texture2D piksel numarasi degil 0-1 araliginda koordinat bekledigi icin merkez koordinati hesaplanir:</w:t>
+      </w:r>
+    </w:p>
+    <w:p>
+      <w:pPr>
+        <w:spacing w:before="60" w:after="140"/>
+        <w:ind w:left="317" w:right="317"/>
+        <w:shd w:fill="F2F4F7"/>
+      </w:pPr>
+      <w:r>
+        <w:rPr>
+          <w:rFonts w:ascii="Consolas" w:hAnsi="Consolas"/>
+          <w:b w:val="0"/>
+          <w:i w:val="0"/>
+          <w:color w:val="17212B"/>
+          <w:sz w:val="18"/>
+        </w:rPr>
+        <w:t>u = (2 + 0.5) / 3 = 0.8333</w:t>
+        <w:br/>
+        <w:t>v = (1 + 0.5) / 3 = 0.5000</w:t>
+        <w:br/>
+        <w:t>texture2D(texture, vec2(0.8333, 0.5000)).r</w:t>
+      </w:r>
+    </w:p>
+    <w:p>
+      <w:pPr>
+        <w:spacing w:after="120" w:line="300" w:lineRule="auto"/>
+      </w:pPr>
+      <w:r>
+        <w:rPr>
+          <w:rFonts w:ascii="Calibri" w:hAnsi="Calibri"/>
+          <w:b w:val="0"/>
+          <w:i w:val="0"/>
+          <w:color w:val="243447"/>
+          <w:sz w:val="22"/>
+        </w:rPr>
+        <w:t>+0.5 texel'in kenarini degil merkezini secmek icindir. GL_NEAREST filtresi sayesinde komsu texel degerleri karistirilmaz. Sondaki .r, matris degerinin saklandigi kirmizi kanali alir.</w:t>
+      </w:r>
+    </w:p>
+    <w:p>
+      <w:pPr>
+        <w:pStyle w:val="Heading2"/>
+      </w:pPr>
+      <w:r>
+        <w:t>3.4 Hesap Nerede Yapilir?</w:t>
+      </w:r>
+    </w:p>
+    <w:p>
+      <w:pPr>
+        <w:spacing w:after="120" w:line="300" w:lineRule="auto"/>
+      </w:pPr>
+      <w:r>
+        <w:rPr>
+          <w:rFonts w:ascii="Calibri" w:hAnsi="Calibri"/>
+          <w:b w:val="0"/>
+          <w:i w:val="0"/>
+          <w:color w:val="243447"/>
+          <w:sz w:val="22"/>
+        </w:rPr>
+        <w:t>Rasterizer her C[i][j] hucresi icin bir fragment uretir. Fragment shader i ve j indislerini gl_FragCoord'dan bulur; A ve B degerlerini texture'dan okur. Carpma-toplama sirasinda acc, GPU shader yurutme biriminin hizli gecici register alaninda tutulur.</w:t>
+      </w:r>
+    </w:p>
+    <w:p>
+      <w:pPr>
+        <w:spacing w:before="60" w:after="140"/>
+        <w:ind w:left="317" w:right="317"/>
+        <w:shd w:fill="F2F4F7"/>
+      </w:pPr>
+      <w:r>
+        <w:rPr>
+          <w:rFonts w:ascii="Consolas" w:hAnsi="Consolas"/>
+          <w:b w:val="0"/>
+          <w:i w:val="0"/>
+          <w:color w:val="17212B"/>
+          <w:sz w:val="18"/>
+        </w:rPr>
+        <w:t>acc = 0</w:t>
+        <w:br/>
+        <w:t>her k icin: acc = acc + A[i][k] * B[k][j]</w:t>
+        <w:br/>
+        <w:t>dongu sonunda: acc = C[i][j]</w:t>
+      </w:r>
+    </w:p>
+    <w:p>
+      <w:pPr>
+        <w:pStyle w:val="Heading2"/>
+      </w:pPr>
+      <w:r>
+        <w:t>3.5 Fragment Sonucu Nereye Yazar?</w:t>
+      </w:r>
+    </w:p>
+    <w:p>
+      <w:pPr>
+        <w:spacing w:after="120" w:line="300" w:lineRule="auto"/>
+      </w:pPr>
+      <w:r>
+        <w:rPr>
+          <w:rFonts w:ascii="Calibri" w:hAnsi="Calibri"/>
+          <w:b w:val="0"/>
+          <w:i w:val="0"/>
+          <w:color w:val="243447"/>
+          <w:sz w:val="22"/>
+        </w:rPr>
+        <w:t>Fragment shader hedef texture'in adini dogrudan yazmaz. CPU daha once C texture'ini bir framebuffer'in color attachment noktasina baglar ve bu FBO'yu aktif yapar. gl_FragColor sonucu, fragment'in gl_FragCoord konumundaki C texel'ine gider.</w:t>
+      </w:r>
+    </w:p>
+    <w:p>
+      <w:pPr>
+        <w:spacing w:before="60" w:after="140"/>
+        <w:ind w:left="317" w:right="317"/>
+        <w:shd w:fill="F2F4F7"/>
+      </w:pPr>
+      <w:r>
+        <w:rPr>
+          <w:rFonts w:ascii="Consolas" w:hAnsi="Consolas"/>
+          <w:b w:val="0"/>
+          <w:i w:val="0"/>
+          <w:color w:val="17212B"/>
+          <w:sz w:val="18"/>
+        </w:rPr>
+        <w:t>glBindFramebuffer(GL_FRAMEBUFFER, output_fbo);</w:t>
+        <w:br/>
+        <w:t>glFramebufferTexture2D(..., output_texture, ...);</w:t>
+        <w:br/>
+        <w:t>// Shader:</w:t>
+        <w:br/>
+        <w:t>gl_FragColor = vec4(acc, 0.0, 0.0, 1.0);</w:t>
+      </w:r>
+    </w:p>
+    <w:p>
+      <w:pPr>
+        <w:spacing w:after="120" w:line="300" w:lineRule="auto"/>
+      </w:pPr>
+      <w:r>
+        <w:rPr>
+          <w:rFonts w:ascii="Calibri" w:hAnsi="Calibri"/>
+          <w:b w:val="0"/>
+          <w:i w:val="0"/>
+          <w:color w:val="243447"/>
+          <w:sz w:val="22"/>
+        </w:rPr>
+        <w:t>Ornegin gl_FragCoord yaklasik (2.5,1.5) ise sonuc C[1][2] texel'ine yazilir. Fragment shader farkli ve rastgele bir adrese yazamaz; yalnizca rasterizer'in kendisi icin belirledigi framebuffer konumuna yazar.</w:t>
+      </w:r>
+    </w:p>
+    <w:p>
+      <w:pPr>
+        <w:pStyle w:val="Heading2"/>
+      </w:pPr>
+      <w:r>
+        <w:t>3.6 Sonuc CPU'ya Nasil Doner?</w:t>
+      </w:r>
+    </w:p>
+    <w:p>
+      <w:pPr>
+        <w:spacing w:after="120" w:line="300" w:lineRule="auto"/>
+      </w:pPr>
+      <w:r>
+        <w:rPr>
+          <w:rFonts w:ascii="Calibri" w:hAnsi="Calibri"/>
+          <w:b w:val="0"/>
+          <w:i w:val="0"/>
+          <w:color w:val="243447"/>
+          <w:sz w:val="22"/>
+        </w:rPr>
+        <w:t>Hesap tamamlandiginda C texture'inin FBO'su baglanir ve glReadPixels ile RGBA veri CPU belleğine kopyalanir. Mevcut RGBA32F masaustu yolunda bir texel dort float, yani 16 byte tasir. Matris sonucu yalnizca R kanalinda oldugu icin CPU her dort float'tan ilkini alir.</w:t>
+      </w:r>
+    </w:p>
+    <w:p>
+      <w:pPr>
+        <w:spacing w:before="60" w:after="140"/>
+        <w:ind w:left="317" w:right="317"/>
+        <w:shd w:fill="F2F4F7"/>
+      </w:pPr>
+      <w:r>
+        <w:rPr>
+          <w:rFonts w:ascii="Consolas" w:hAnsi="Consolas"/>
+          <w:b w:val="0"/>
+          <w:i w:val="0"/>
+          <w:color w:val="17212B"/>
+          <w:sz w:val="18"/>
+        </w:rPr>
+        <w:t>glReadPixels(..., GL_RGBA, GL_FLOAT, rgba);</w:t>
+        <w:br/>
+        <w:t>dst[i] = rgba[i * 4];  // yalnizca R kanali</w:t>
+      </w:r>
+    </w:p>
+    <w:p>
+      <w:pPr>
+        <w:pStyle w:val="Heading2"/>
+      </w:pPr>
+      <w:r>
+        <w:t>3.7 Compute ve Fragment Karsilastirmasi</w:t>
+      </w:r>
+    </w:p>
+    <w:tbl>
+      <w:tblPr>
+        <w:tblStyle w:val="TableGrid"/>
+        <w:tblW w:type="dxa" w:w="9360"/>
+        <w:jc w:val="left"/>
+        <w:tblLayout w:type="fixed"/>
+        <w:tblLook w:firstColumn="1" w:firstRow="1" w:lastColumn="0" w:lastRow="0" w:noHBand="0" w:noVBand="1" w:val="04A0"/>
+        <w:tblInd w:w="120" w:type="dxa"/>
+      </w:tblPr>
+      <w:tblGrid>
+        <w:gridCol w:w="1800"/>
+        <w:gridCol w:w="3100"/>
+        <w:gridCol w:w="4460"/>
+      </w:tblGrid>
+      <w:tr>
+        <w:trPr>
+          <w:tblHeader/>
+        </w:trPr>
+        <w:tc>
+          <w:tcPr>
+            <w:tcW w:type="dxa" w:w="1800"/>
+            <w:shd w:fill="E8EEF5"/>
+            <w:vAlign w:val="center"/>
+            <w:tcMar>
+              <w:top w:w="80" w:type="dxa"/>
+              <w:start w:w="120" w:type="dxa"/>
+              <w:bottom w:w="80" w:type="dxa"/>
+              <w:end w:w="120" w:type="dxa"/>
+            </w:tcMar>
+          </w:tcPr>
+          <w:p>
+            <w:pPr>
+              <w:spacing w:after="0"/>
+              <w:jc w:val="center"/>
+            </w:pPr>
+            <w:r>
+              <w:rPr>
+                <w:rFonts w:ascii="Calibri" w:hAnsi="Calibri"/>
+                <w:b/>
+                <w:i w:val="0"/>
+                <w:color w:val="1F4D78"/>
+                <w:sz w:val="19"/>
+              </w:rPr>
+              <w:t>Konu</w:t>
+            </w:r>
+          </w:p>
+        </w:tc>
+        <w:tc>
+          <w:tcPr>
+            <w:tcW w:type="dxa" w:w="3100"/>
+            <w:shd w:fill="E8EEF5"/>
+            <w:vAlign w:val="center"/>
+            <w:tcMar>
+              <w:top w:w="80" w:type="dxa"/>
+              <w:start w:w="120" w:type="dxa"/>
+              <w:bottom w:w="80" w:type="dxa"/>
+              <w:end w:w="120" w:type="dxa"/>
+            </w:tcMar>
+          </w:tcPr>
+          <w:p>
+            <w:pPr>
+              <w:spacing w:after="0"/>
+              <w:jc w:val="center"/>
+            </w:pPr>
+            <w:r>
+              <w:rPr>
+                <w:rFonts w:ascii="Calibri" w:hAnsi="Calibri"/>
+                <w:b/>
+                <w:i w:val="0"/>
+                <w:color w:val="1F4D78"/>
+                <w:sz w:val="19"/>
+              </w:rPr>
+              <w:t>Compute</w:t>
+            </w:r>
+          </w:p>
+        </w:tc>
+        <w:tc>
+          <w:tcPr>
+            <w:tcW w:type="dxa" w:w="4460"/>
+            <w:shd w:fill="E8EEF5"/>
+            <w:vAlign w:val="center"/>
+            <w:tcMar>
+              <w:top w:w="80" w:type="dxa"/>
+              <w:start w:w="120" w:type="dxa"/>
+              <w:bottom w:w="80" w:type="dxa"/>
+              <w:end w:w="120" w:type="dxa"/>
+            </w:tcMar>
+          </w:tcPr>
+          <w:p>
+            <w:pPr>
+              <w:spacing w:after="0"/>
+              <w:jc w:val="center"/>
+            </w:pPr>
+            <w:r>
+              <w:rPr>
+                <w:rFonts w:ascii="Calibri" w:hAnsi="Calibri"/>
+                <w:b/>
+                <w:i w:val="0"/>
+                <w:color w:val="1F4D78"/>
+                <w:sz w:val="19"/>
+              </w:rPr>
+              <w:t>Fragment</w:t>
+            </w:r>
+          </w:p>
+        </w:tc>
+      </w:tr>
+      <w:tr>
+        <w:tc>
+          <w:tcPr>
+            <w:tcW w:type="dxa" w:w="1800"/>
+            <w:vAlign w:val="center"/>
+            <w:tcMar>
+              <w:top w:w="80" w:type="dxa"/>
+              <w:start w:w="120" w:type="dxa"/>
+              <w:bottom w:w="80" w:type="dxa"/>
+              <w:end w:w="120" w:type="dxa"/>
+            </w:tcMar>
+          </w:tcPr>
+          <w:p>
+            <w:pPr>
+              <w:spacing w:after="0"/>
+            </w:pPr>
+            <w:r>
+              <w:rPr>
+                <w:rFonts w:ascii="Calibri" w:hAnsi="Calibri"/>
+                <w:b/>
+                <w:i w:val="0"/>
+                <w:color w:val="243447"/>
+                <w:sz w:val="18"/>
+              </w:rPr>
+              <w:t>Girdi</w:t>
+            </w:r>
+          </w:p>
+        </w:tc>
+        <w:tc>
+          <w:tcPr>
+            <w:tcW w:type="dxa" w:w="3100"/>
+            <w:vAlign w:val="center"/>
+            <w:tcMar>
+              <w:top w:w="80" w:type="dxa"/>
+              <w:start w:w="120" w:type="dxa"/>
+              <w:bottom w:w="80" w:type="dxa"/>
+              <w:end w:w="120" w:type="dxa"/>
+            </w:tcMar>
+          </w:tcPr>
+          <w:p>
+            <w:pPr>
+              <w:spacing w:after="0"/>
+            </w:pPr>
+            <w:r>
+              <w:rPr>
+                <w:rFonts w:ascii="Calibri" w:hAnsi="Calibri"/>
+                <w:b w:val="0"/>
+                <w:i w:val="0"/>
+                <w:color w:val="243447"/>
+                <w:sz w:val="18"/>
+              </w:rPr>
+              <w:t>SSBO: float A[]</w:t>
+            </w:r>
+          </w:p>
+        </w:tc>
+        <w:tc>
+          <w:tcPr>
+            <w:tcW w:type="dxa" w:w="4460"/>
+            <w:vAlign w:val="center"/>
+            <w:tcMar>
+              <w:top w:w="80" w:type="dxa"/>
+              <w:start w:w="120" w:type="dxa"/>
+              <w:bottom w:w="80" w:type="dxa"/>
+              <w:end w:w="120" w:type="dxa"/>
+            </w:tcMar>
+          </w:tcPr>
+          <w:p>
+            <w:pPr>
+              <w:spacing w:after="0"/>
+            </w:pPr>
+            <w:r>
+              <w:rPr>
+                <w:rFonts w:ascii="Calibri" w:hAnsi="Calibri"/>
+                <w:b w:val="0"/>
+                <w:i w:val="0"/>
+                <w:color w:val="243447"/>
+                <w:sz w:val="18"/>
+              </w:rPr>
+              <w:t>RGBA32F texture</w:t>
+            </w:r>
+          </w:p>
+        </w:tc>
+      </w:tr>
+      <w:tr>
+        <w:tc>
+          <w:tcPr>
+            <w:tcW w:type="dxa" w:w="1800"/>
+            <w:shd w:fill="F4F6F9"/>
+            <w:vAlign w:val="center"/>
+            <w:tcMar>
+              <w:top w:w="80" w:type="dxa"/>
+              <w:start w:w="120" w:type="dxa"/>
+              <w:bottom w:w="80" w:type="dxa"/>
+              <w:end w:w="120" w:type="dxa"/>
+            </w:tcMar>
+          </w:tcPr>
+          <w:p>
+            <w:pPr>
+              <w:spacing w:after="0"/>
+            </w:pPr>
+            <w:r>
+              <w:rPr>
+                <w:rFonts w:ascii="Calibri" w:hAnsi="Calibri"/>
+                <w:b/>
+                <w:i w:val="0"/>
+                <w:color w:val="243447"/>
+                <w:sz w:val="18"/>
+              </w:rPr>
+              <w:t>Okuma</w:t>
+            </w:r>
+          </w:p>
+        </w:tc>
+        <w:tc>
+          <w:tcPr>
+            <w:tcW w:type="dxa" w:w="3100"/>
+            <w:shd w:fill="F4F6F9"/>
+            <w:vAlign w:val="center"/>
+            <w:tcMar>
+              <w:top w:w="80" w:type="dxa"/>
+              <w:start w:w="120" w:type="dxa"/>
+              <w:bottom w:w="80" w:type="dxa"/>
+              <w:end w:w="120" w:type="dxa"/>
+            </w:tcMar>
+          </w:tcPr>
+          <w:p>
+            <w:pPr>
+              <w:spacing w:after="0"/>
+            </w:pPr>
+            <w:r>
+              <w:rPr>
+                <w:rFonts w:ascii="Calibri" w:hAnsi="Calibri"/>
+                <w:b w:val="0"/>
+                <w:i w:val="0"/>
+                <w:color w:val="243447"/>
+                <w:sz w:val="18"/>
+              </w:rPr>
+              <w:t>A[index]</w:t>
+            </w:r>
+          </w:p>
+        </w:tc>
+        <w:tc>
+          <w:tcPr>
+            <w:tcW w:type="dxa" w:w="4460"/>
+            <w:shd w:fill="F4F6F9"/>
+            <w:vAlign w:val="center"/>
+            <w:tcMar>
+              <w:top w:w="80" w:type="dxa"/>
+              <w:start w:w="120" w:type="dxa"/>
+              <w:bottom w:w="80" w:type="dxa"/>
+              <w:end w:w="120" w:type="dxa"/>
+            </w:tcMar>
+          </w:tcPr>
+          <w:p>
+            <w:pPr>
+              <w:spacing w:after="0"/>
+            </w:pPr>
+            <w:r>
+              <w:rPr>
+                <w:rFonts w:ascii="Calibri" w:hAnsi="Calibri"/>
+                <w:b w:val="0"/>
+                <w:i w:val="0"/>
+                <w:color w:val="243447"/>
+                <w:sz w:val="18"/>
+              </w:rPr>
+              <w:t>index -&gt; x/y -&gt; u/v -&gt; texture2D(...).r</w:t>
+            </w:r>
+          </w:p>
+        </w:tc>
+      </w:tr>
+      <w:tr>
+        <w:tc>
+          <w:tcPr>
+            <w:tcW w:type="dxa" w:w="1800"/>
+            <w:vAlign w:val="center"/>
+            <w:tcMar>
+              <w:top w:w="80" w:type="dxa"/>
+              <w:start w:w="120" w:type="dxa"/>
+              <w:bottom w:w="80" w:type="dxa"/>
+              <w:end w:w="120" w:type="dxa"/>
+            </w:tcMar>
+          </w:tcPr>
+          <w:p>
+            <w:pPr>
+              <w:spacing w:after="0"/>
+            </w:pPr>
+            <w:r>
+              <w:rPr>
+                <w:rFonts w:ascii="Calibri" w:hAnsi="Calibri"/>
+                <w:b/>
+                <w:i w:val="0"/>
+                <w:color w:val="243447"/>
+                <w:sz w:val="18"/>
+              </w:rPr>
+              <w:t>Indis turu</w:t>
+            </w:r>
+          </w:p>
+        </w:tc>
+        <w:tc>
+          <w:tcPr>
+            <w:tcW w:type="dxa" w:w="3100"/>
+            <w:vAlign w:val="center"/>
+            <w:tcMar>
+              <w:top w:w="80" w:type="dxa"/>
+              <w:start w:w="120" w:type="dxa"/>
+              <w:bottom w:w="80" w:type="dxa"/>
+              <w:end w:w="120" w:type="dxa"/>
+            </w:tcMar>
+          </w:tcPr>
+          <w:p>
+            <w:pPr>
+              <w:spacing w:after="0"/>
+            </w:pPr>
+            <w:r>
+              <w:rPr>
+                <w:rFonts w:ascii="Calibri" w:hAnsi="Calibri"/>
+                <w:b w:val="0"/>
+                <w:i w:val="0"/>
+                <w:color w:val="243447"/>
+                <w:sz w:val="18"/>
+              </w:rPr>
+              <w:t>Dogrudan int indis</w:t>
+            </w:r>
+          </w:p>
+        </w:tc>
+        <w:tc>
+          <w:tcPr>
+            <w:tcW w:type="dxa" w:w="4460"/>
+            <w:vAlign w:val="center"/>
+            <w:tcMar>
+              <w:top w:w="80" w:type="dxa"/>
+              <w:start w:w="120" w:type="dxa"/>
+              <w:bottom w:w="80" w:type="dxa"/>
+              <w:end w:w="120" w:type="dxa"/>
+            </w:tcMar>
+          </w:tcPr>
+          <w:p>
+            <w:pPr>
+              <w:spacing w:after="0"/>
+            </w:pPr>
+            <w:r>
+              <w:rPr>
+                <w:rFonts w:ascii="Calibri" w:hAnsi="Calibri"/>
+                <w:b w:val="0"/>
+                <w:i w:val="0"/>
+                <w:color w:val="243447"/>
+                <w:sz w:val="18"/>
+              </w:rPr>
+              <w:t>ES 2.0 yolunda agirlikli float indis</w:t>
+            </w:r>
+          </w:p>
+        </w:tc>
+      </w:tr>
+      <w:tr>
+        <w:tc>
+          <w:tcPr>
+            <w:tcW w:type="dxa" w:w="1800"/>
+            <w:shd w:fill="F4F6F9"/>
+            <w:vAlign w:val="center"/>
+            <w:tcMar>
+              <w:top w:w="80" w:type="dxa"/>
+              <w:start w:w="120" w:type="dxa"/>
+              <w:bottom w:w="80" w:type="dxa"/>
+              <w:end w:w="120" w:type="dxa"/>
+            </w:tcMar>
+          </w:tcPr>
+          <w:p>
+            <w:pPr>
+              <w:spacing w:after="0"/>
+            </w:pPr>
+            <w:r>
+              <w:rPr>
+                <w:rFonts w:ascii="Calibri" w:hAnsi="Calibri"/>
+                <w:b/>
+                <w:i w:val="0"/>
+                <w:color w:val="243447"/>
+                <w:sz w:val="18"/>
+              </w:rPr>
+              <w:t>Hesap</w:t>
+            </w:r>
+          </w:p>
+        </w:tc>
+        <w:tc>
+          <w:tcPr>
+            <w:tcW w:type="dxa" w:w="3100"/>
+            <w:shd w:fill="F4F6F9"/>
+            <w:vAlign w:val="center"/>
+            <w:tcMar>
+              <w:top w:w="80" w:type="dxa"/>
+              <w:start w:w="120" w:type="dxa"/>
+              <w:bottom w:w="80" w:type="dxa"/>
+              <w:end w:w="120" w:type="dxa"/>
+            </w:tcMar>
+          </w:tcPr>
+          <w:p>
+            <w:pPr>
+              <w:spacing w:after="0"/>
+            </w:pPr>
+            <w:r>
+              <w:rPr>
+                <w:rFonts w:ascii="Calibri" w:hAnsi="Calibri"/>
+                <w:b w:val="0"/>
+                <w:i w:val="0"/>
+                <w:color w:val="243447"/>
+                <w:sz w:val="18"/>
+              </w:rPr>
+              <w:t>GPU shader register'lari</w:t>
+            </w:r>
+          </w:p>
+        </w:tc>
+        <w:tc>
+          <w:tcPr>
+            <w:tcW w:type="dxa" w:w="4460"/>
+            <w:shd w:fill="F4F6F9"/>
+            <w:vAlign w:val="center"/>
+            <w:tcMar>
+              <w:top w:w="80" w:type="dxa"/>
+              <w:start w:w="120" w:type="dxa"/>
+              <w:bottom w:w="80" w:type="dxa"/>
+              <w:end w:w="120" w:type="dxa"/>
+            </w:tcMar>
+          </w:tcPr>
+          <w:p>
+            <w:pPr>
+              <w:spacing w:after="0"/>
+            </w:pPr>
+            <w:r>
+              <w:rPr>
+                <w:rFonts w:ascii="Calibri" w:hAnsi="Calibri"/>
+                <w:b w:val="0"/>
+                <w:i w:val="0"/>
+                <w:color w:val="243447"/>
+                <w:sz w:val="18"/>
+              </w:rPr>
+              <w:t>GPU shader register'lari</w:t>
+            </w:r>
+          </w:p>
+        </w:tc>
+      </w:tr>
+      <w:tr>
+        <w:tc>
+          <w:tcPr>
+            <w:tcW w:type="dxa" w:w="1800"/>
+            <w:vAlign w:val="center"/>
+            <w:tcMar>
+              <w:top w:w="80" w:type="dxa"/>
+              <w:start w:w="120" w:type="dxa"/>
+              <w:bottom w:w="80" w:type="dxa"/>
+              <w:end w:w="120" w:type="dxa"/>
+            </w:tcMar>
+          </w:tcPr>
+          <w:p>
+            <w:pPr>
+              <w:spacing w:after="0"/>
+            </w:pPr>
+            <w:r>
+              <w:rPr>
+                <w:rFonts w:ascii="Calibri" w:hAnsi="Calibri"/>
+                <w:b/>
+                <w:i w:val="0"/>
+                <w:color w:val="243447"/>
+                <w:sz w:val="18"/>
+              </w:rPr>
+              <w:t>Yazma</w:t>
+            </w:r>
+          </w:p>
+        </w:tc>
+        <w:tc>
+          <w:tcPr>
+            <w:tcW w:type="dxa" w:w="3100"/>
+            <w:vAlign w:val="center"/>
+            <w:tcMar>
+              <w:top w:w="80" w:type="dxa"/>
+              <w:start w:w="120" w:type="dxa"/>
+              <w:bottom w:w="80" w:type="dxa"/>
+              <w:end w:w="120" w:type="dxa"/>
+            </w:tcMar>
+          </w:tcPr>
+          <w:p>
+            <w:pPr>
+              <w:spacing w:after="0"/>
+            </w:pPr>
+            <w:r>
+              <w:rPr>
+                <w:rFonts w:ascii="Calibri" w:hAnsi="Calibri"/>
+                <w:b w:val="0"/>
+                <w:i w:val="0"/>
+                <w:color w:val="243447"/>
+                <w:sz w:val="18"/>
+              </w:rPr>
+              <w:t>C[index] = acc</w:t>
+            </w:r>
+          </w:p>
+        </w:tc>
+        <w:tc>
+          <w:tcPr>
+            <w:tcW w:type="dxa" w:w="4460"/>
+            <w:vAlign w:val="center"/>
+            <w:tcMar>
+              <w:top w:w="80" w:type="dxa"/>
+              <w:start w:w="120" w:type="dxa"/>
+              <w:bottom w:w="80" w:type="dxa"/>
+              <w:end w:w="120" w:type="dxa"/>
+            </w:tcMar>
+          </w:tcPr>
+          <w:p>
+            <w:pPr>
+              <w:spacing w:after="0"/>
+            </w:pPr>
+            <w:r>
+              <w:rPr>
+                <w:rFonts w:ascii="Calibri" w:hAnsi="Calibri"/>
+                <w:b w:val="0"/>
+                <w:i w:val="0"/>
+                <w:color w:val="243447"/>
+                <w:sz w:val="18"/>
+              </w:rPr>
+              <w:t>gl_FragColor -&gt; aktif FBO texture'i</w:t>
+            </w:r>
+          </w:p>
+        </w:tc>
+      </w:tr>
+      <w:tr>
+        <w:tc>
+          <w:tcPr>
+            <w:tcW w:type="dxa" w:w="1800"/>
+            <w:shd w:fill="F4F6F9"/>
+            <w:vAlign w:val="center"/>
+            <w:tcMar>
+              <w:top w:w="80" w:type="dxa"/>
+              <w:start w:w="120" w:type="dxa"/>
+              <w:bottom w:w="80" w:type="dxa"/>
+              <w:end w:w="120" w:type="dxa"/>
+            </w:tcMar>
+          </w:tcPr>
+          <w:p>
+            <w:pPr>
+              <w:spacing w:after="0"/>
+            </w:pPr>
+            <w:r>
+              <w:rPr>
+                <w:rFonts w:ascii="Calibri" w:hAnsi="Calibri"/>
+                <w:b/>
+                <w:i w:val="0"/>
+                <w:color w:val="243447"/>
+                <w:sz w:val="18"/>
+              </w:rPr>
+              <w:t>Hedef adres</w:t>
+            </w:r>
+          </w:p>
+        </w:tc>
+        <w:tc>
+          <w:tcPr>
+            <w:tcW w:type="dxa" w:w="3100"/>
+            <w:shd w:fill="F4F6F9"/>
+            <w:vAlign w:val="center"/>
+            <w:tcMar>
+              <w:top w:w="80" w:type="dxa"/>
+              <w:start w:w="120" w:type="dxa"/>
+              <w:bottom w:w="80" w:type="dxa"/>
+              <w:end w:w="120" w:type="dxa"/>
+            </w:tcMar>
+          </w:tcPr>
+          <w:p>
+            <w:pPr>
+              <w:spacing w:after="0"/>
+            </w:pPr>
+            <w:r>
+              <w:rPr>
+                <w:rFonts w:ascii="Calibri" w:hAnsi="Calibri"/>
+                <w:b w:val="0"/>
+                <w:i w:val="0"/>
+                <w:color w:val="243447"/>
+                <w:sz w:val="18"/>
+              </w:rPr>
+              <w:t>Shader istedigi buffer indisini secebilir</w:t>
+            </w:r>
+          </w:p>
+        </w:tc>
+        <w:tc>
+          <w:tcPr>
+            <w:tcW w:type="dxa" w:w="4460"/>
+            <w:shd w:fill="F4F6F9"/>
+            <w:vAlign w:val="center"/>
+            <w:tcMar>
+              <w:top w:w="80" w:type="dxa"/>
+              <w:start w:w="120" w:type="dxa"/>
+              <w:bottom w:w="80" w:type="dxa"/>
+              <w:end w:w="120" w:type="dxa"/>
+            </w:tcMar>
+          </w:tcPr>
+          <w:p>
+            <w:pPr>
+              <w:spacing w:after="0"/>
+            </w:pPr>
+            <w:r>
+              <w:rPr>
+                <w:rFonts w:ascii="Calibri" w:hAnsi="Calibri"/>
+                <w:b w:val="0"/>
+                <w:i w:val="0"/>
+                <w:color w:val="243447"/>
+                <w:sz w:val="18"/>
+              </w:rPr>
+              <w:t>gl_FragCoord ile belirlenen texel</w:t>
+            </w:r>
+          </w:p>
+        </w:tc>
+      </w:tr>
+      <w:tr>
+        <w:tc>
+          <w:tcPr>
+            <w:tcW w:type="dxa" w:w="1800"/>
+            <w:vAlign w:val="center"/>
+            <w:tcMar>
+              <w:top w:w="80" w:type="dxa"/>
+              <w:start w:w="120" w:type="dxa"/>
+              <w:bottom w:w="80" w:type="dxa"/>
+              <w:end w:w="120" w:type="dxa"/>
+            </w:tcMar>
+          </w:tcPr>
+          <w:p>
+            <w:pPr>
+              <w:spacing w:after="0"/>
+            </w:pPr>
+            <w:r>
+              <w:rPr>
+                <w:rFonts w:ascii="Calibri" w:hAnsi="Calibri"/>
+                <w:b/>
+                <w:i w:val="0"/>
+                <w:color w:val="243447"/>
+                <w:sz w:val="18"/>
+              </w:rPr>
+              <w:t>Hucre depolama</w:t>
+            </w:r>
+          </w:p>
+        </w:tc>
+        <w:tc>
+          <w:tcPr>
+            <w:tcW w:type="dxa" w:w="3100"/>
+            <w:vAlign w:val="center"/>
+            <w:tcMar>
+              <w:top w:w="80" w:type="dxa"/>
+              <w:start w:w="120" w:type="dxa"/>
+              <w:bottom w:w="80" w:type="dxa"/>
+              <w:end w:w="120" w:type="dxa"/>
+            </w:tcMar>
+          </w:tcPr>
+          <w:p>
+            <w:pPr>
+              <w:spacing w:after="0"/>
+            </w:pPr>
+            <w:r>
+              <w:rPr>
+                <w:rFonts w:ascii="Calibri" w:hAnsi="Calibri"/>
+                <w:b w:val="0"/>
+                <w:i w:val="0"/>
+                <w:color w:val="243447"/>
+                <w:sz w:val="18"/>
+              </w:rPr>
+              <w:t>1 float = 4 byte</w:t>
+            </w:r>
+          </w:p>
+        </w:tc>
+        <w:tc>
+          <w:tcPr>
+            <w:tcW w:type="dxa" w:w="4460"/>
+            <w:vAlign w:val="center"/>
+            <w:tcMar>
+              <w:top w:w="80" w:type="dxa"/>
+              <w:start w:w="120" w:type="dxa"/>
+              <w:bottom w:w="80" w:type="dxa"/>
+              <w:end w:w="120" w:type="dxa"/>
+            </w:tcMar>
+          </w:tcPr>
+          <w:p>
+            <w:pPr>
+              <w:spacing w:after="0"/>
+            </w:pPr>
+            <w:r>
+              <w:rPr>
+                <w:rFonts w:ascii="Calibri" w:hAnsi="Calibri"/>
+                <w:b w:val="0"/>
+                <w:i w:val="0"/>
+                <w:color w:val="243447"/>
+                <w:sz w:val="18"/>
+              </w:rPr>
+              <w:t>RGBA32F = 4 float = 16 byte</w:t>
+            </w:r>
+          </w:p>
+        </w:tc>
+      </w:tr>
+      <w:tr>
+        <w:tc>
+          <w:tcPr>
+            <w:tcW w:type="dxa" w:w="1800"/>
+            <w:shd w:fill="F4F6F9"/>
+            <w:vAlign w:val="center"/>
+            <w:tcMar>
+              <w:top w:w="80" w:type="dxa"/>
+              <w:start w:w="120" w:type="dxa"/>
+              <w:bottom w:w="80" w:type="dxa"/>
+              <w:end w:w="120" w:type="dxa"/>
+            </w:tcMar>
+          </w:tcPr>
+          <w:p>
+            <w:pPr>
+              <w:spacing w:after="0"/>
+            </w:pPr>
+            <w:r>
+              <w:rPr>
+                <w:rFonts w:ascii="Calibri" w:hAnsi="Calibri"/>
+                <w:b/>
+                <w:i w:val="0"/>
+                <w:color w:val="243447"/>
+                <w:sz w:val="18"/>
+              </w:rPr>
+              <w:t>CPU'ya donus</w:t>
+            </w:r>
+          </w:p>
+        </w:tc>
+        <w:tc>
+          <w:tcPr>
+            <w:tcW w:type="dxa" w:w="3100"/>
+            <w:shd w:fill="F4F6F9"/>
+            <w:vAlign w:val="center"/>
+            <w:tcMar>
+              <w:top w:w="80" w:type="dxa"/>
+              <w:start w:w="120" w:type="dxa"/>
+              <w:bottom w:w="80" w:type="dxa"/>
+              <w:end w:w="120" w:type="dxa"/>
+            </w:tcMar>
+          </w:tcPr>
+          <w:p>
+            <w:pPr>
+              <w:spacing w:after="0"/>
+            </w:pPr>
+            <w:r>
+              <w:rPr>
+                <w:rFonts w:ascii="Calibri" w:hAnsi="Calibri"/>
+                <w:b w:val="0"/>
+                <w:i w:val="0"/>
+                <w:color w:val="243447"/>
+                <w:sz w:val="18"/>
+              </w:rPr>
+              <w:t>glGetBufferSubData</w:t>
+            </w:r>
+          </w:p>
+        </w:tc>
+        <w:tc>
+          <w:tcPr>
+            <w:tcW w:type="dxa" w:w="4460"/>
+            <w:shd w:fill="F4F6F9"/>
+            <w:vAlign w:val="center"/>
+            <w:tcMar>
+              <w:top w:w="80" w:type="dxa"/>
+              <w:start w:w="120" w:type="dxa"/>
+              <w:bottom w:w="80" w:type="dxa"/>
+              <w:end w:w="120" w:type="dxa"/>
+            </w:tcMar>
+          </w:tcPr>
+          <w:p>
+            <w:pPr>
+              <w:spacing w:after="0"/>
+            </w:pPr>
+            <w:r>
+              <w:rPr>
+                <w:rFonts w:ascii="Calibri" w:hAnsi="Calibri"/>
+                <w:b w:val="0"/>
+                <w:i w:val="0"/>
+                <w:color w:val="243447"/>
+                <w:sz w:val="18"/>
+              </w:rPr>
+              <w:t>glReadPixels ve R kanalini ayiklama</w:t>
+            </w:r>
+          </w:p>
+        </w:tc>
+      </w:tr>
+    </w:tbl>
+    <w:p>
+      <w:pPr>
+        <w:pStyle w:val="Heading2"/>
+      </w:pPr>
+      <w:r>
+        <w:t>3.8 Neden Performans Farki Olusur?</w:t>
+      </w:r>
+    </w:p>
+    <w:p>
+      <w:pPr>
+        <w:spacing w:after="120" w:line="300" w:lineRule="auto"/>
+      </w:pPr>
+      <w:r>
+        <w:rPr>
+          <w:rFonts w:ascii="Calibri" w:hAnsi="Calibri"/>
+          <w:b w:val="0"/>
+          <w:i w:val="0"/>
+          <w:color w:val="243447"/>
+          <w:sz w:val="22"/>
+        </w:rPr>
+        <w:t>Matris carpiminda her C hucresi icin K kez A ve B okunur. Fragment yolundaki x/y ve normalize koordinat hesaplari her texture okumasinda tekrarlanir. Ayrica RGBA32F formati tek float SSBO'ya gore dort kat fiziksel depolama kullanir ve geri okumada dort kanal tasir. GPU cache ve surucu optimizasyonlari gercek trafik miktarini degistirebilse de, compute yolu veri modeli acisindan daha dogrudandir.</w:t>
+      </w:r>
+    </w:p>
+    <w:p>
+      <w:pPr>
+        <w:spacing w:before="160" w:after="160"/>
+        <w:ind w:left="259" w:right="259"/>
+        <w:shd w:fill="E8EEF5"/>
+      </w:pPr>
+      <w:r>
+        <w:rPr>
+          <w:rFonts w:ascii="Calibri" w:hAnsi="Calibri"/>
+          <w:b/>
+          <w:i w:val="0"/>
+          <w:color w:val="1F4D78"/>
+          <w:sz w:val="22"/>
+        </w:rPr>
+        <w:t xml:space="preserve">Kritik sonuc: </w:t>
+      </w:r>
+      <w:r>
+        <w:rPr>
+          <w:rFonts w:ascii="Calibri" w:hAnsi="Calibri"/>
+          <w:b w:val="0"/>
+          <w:i w:val="0"/>
+          <w:color w:val="243447"/>
+          <w:sz w:val="22"/>
+        </w:rPr>
+        <w:t>Iki yol da matematiksel hesabi GPU shader cekirdeklerinde yapar. Compute, veriyi dogrudan SSBO dizisinden okuyup SSBO'ya yazar. Fragment ise veriyi texture koordinatina cevirerek okur ve sonucu aktif framebuffer'a bagli RGBA texture'a yazar.</w:t>
+      </w:r>
+    </w:p>
     <w:sectPr>
       <w:headerReference w:type="default" r:id="rId9"/>
       <w:footerReference w:type="default" r:id="rId10"/>

</xml_diff>